<commit_message>
Regenerate canonical outputs from b49d9a8 (category-level engine, 2008-02 window)
Outputs-only commit: manifest/CSVs/figures/docx now correspond to the category-level
Smart Rebalancing engine and the common 2008-02..2026-06 sample window. Manifest
references b49d9a8 as the generating code commit. Adds
robustness_granular_vs_category.csv (band-architecture robustness).

Co-Authored-By: Claude Opus 4.8 <noreply@anthropic.com>
Claude-Session: https://claude.ai/code/session_01BpRuhc2aBcap5ePk6Ra9LE
</commit_message>
<xml_diff>
--- a/reports/docx/Bond_replacement_full_report_EN.docx
+++ b/reports/docx/Bond_replacement_full_report_EN.docx
@@ -455,7 +455,7 @@
         <w:t xml:space="preserve"> </w:t>
       </w:r>
       <w:r>
-        <w:t xml:space="preserve">difference (P(ΔCAGR&gt;0) ≈ 80–84%; the 95% CI includes zero at each level).</w:t>
+        <w:t xml:space="preserve">difference (P(ΔCAGR&gt;0) ≈ 82–84%; the 95% CI includes zero at each level).</w:t>
       </w:r>
     </w:p>
     <w:p>
@@ -609,10 +609,60 @@
           <w:bCs/>
           <w:b/>
         </w:rPr>
-        <w:t xml:space="preserve">H4 — qualified</w:t>
-      </w:r>
-      <w:r>
-        <w:t xml:space="preserve">: partial replacement is the better</w:t>
+        <w:t xml:space="preserve">H4 — qualified / not supported as a Sharpe claim</w:t>
+      </w:r>
+      <w:r>
+        <w:t xml:space="preserve">: under the primary category-level</w:t>
+      </w:r>
+      <w:r>
+        <w:t xml:space="preserve"> </w:t>
+      </w:r>
+      <w:r>
+        <w:t xml:space="preserve">specification the Sharpe is</w:t>
+      </w:r>
+      <w:r>
+        <w:t xml:space="preserve"> </w:t>
+      </w:r>
+      <w:r>
+        <w:rPr>
+          <w:bCs/>
+          <w:b/>
+        </w:rPr>
+        <w:t xml:space="preserve">flat-to-declining in replacement</w:t>
+      </w:r>
+      <w:r>
+        <w:t xml:space="preserve"> </w:t>
+      </w:r>
+      <w:r>
+        <w:t xml:space="preserve">(highest at AP5, ≈0.48 through</w:t>
+      </w:r>
+      <w:r>
+        <w:t xml:space="preserve"> </w:t>
+      </w:r>
+      <w:r>
+        <w:t xml:space="preserve">~50%, then falling), and every ΔSharpe is</w:t>
+      </w:r>
+      <w:r>
+        <w:t xml:space="preserve"> </w:t>
+      </w:r>
+      <w:r>
+        <w:rPr>
+          <w:bCs/>
+          <w:b/>
+        </w:rPr>
+        <w:t xml:space="preserve">within bootstrap noise</w:t>
+      </w:r>
+      <w:r>
+        <w:t xml:space="preserve"> </w:t>
+      </w:r>
+      <w:r>
+        <w:t xml:space="preserve">— so partial replacement is</w:t>
+      </w:r>
+      <w:r>
+        <w:t xml:space="preserve"> </w:t>
+      </w:r>
+      <w:r>
+        <w:t xml:space="preserve">a defensible return-and-risk</w:t>
       </w:r>
       <w:r>
         <w:t xml:space="preserve"> </w:t>
@@ -625,32 +675,10 @@
         <w:t xml:space="preserve">compromise</w:t>
       </w:r>
       <w:r>
-        <w:t xml:space="preserve">, but the risk-adjusted</w:t>
-      </w:r>
-      <w:r>
-        <w:t xml:space="preserve"> </w:t>
-      </w:r>
-      <w:r>
-        <w:t xml:space="preserve">(Sharpe) differences across low-to-moderate replacement are</w:t>
-      </w:r>
-      <w:r>
-        <w:t xml:space="preserve"> </w:t>
-      </w:r>
-      <w:r>
-        <w:rPr>
-          <w:bCs/>
-          <w:b/>
-        </w:rPr>
-        <w:t xml:space="preserve">within bootstrap noise</w:t>
-      </w:r>
-      <w:r>
-        <w:t xml:space="preserve">, so we</w:t>
-      </w:r>
-      <w:r>
-        <w:t xml:space="preserve"> </w:t>
-      </w:r>
-      <w:r>
-        <w:t xml:space="preserve">do</w:t>
+        <w:t xml:space="preserve"> </w:t>
+      </w:r>
+      <w:r>
+        <w:t xml:space="preserve">but is</w:t>
       </w:r>
       <w:r>
         <w:t xml:space="preserve"> </w:t>
@@ -666,7 +694,29 @@
         <w:t xml:space="preserve"> </w:t>
       </w:r>
       <w:r>
-        <w:t xml:space="preserve">claim a unique optimal ratio. Full replacement is not supported.</w:t>
+        <w:t xml:space="preserve">a risk-adjusted improvement and there</w:t>
+      </w:r>
+      <w:r>
+        <w:t xml:space="preserve"> </w:t>
+      </w:r>
+      <w:r>
+        <w:t xml:space="preserve">is</w:t>
+      </w:r>
+      <w:r>
+        <w:t xml:space="preserve"> </w:t>
+      </w:r>
+      <w:r>
+        <w:rPr>
+          <w:bCs/>
+          <w:b/>
+        </w:rPr>
+        <w:t xml:space="preserve">no</w:t>
+      </w:r>
+      <w:r>
+        <w:t xml:space="preserve"> </w:t>
+      </w:r>
+      <w:r>
+        <w:t xml:space="preserve">unique optimal ratio. Full replacement is not supported.</w:t>
       </w:r>
     </w:p>
     <w:bookmarkEnd w:id="20"/>
@@ -1701,13 +1751,50 @@
         <w:t xml:space="preserve"> </w:t>
       </w:r>
       <w:r>
-        <w:t xml:space="preserve">(US ETFs such as HYG/EMB require authorisation to be offered to non-qualified Swiss investors,</w:t>
-      </w:r>
-      <w:r>
-        <w:t xml:space="preserve"> </w:t>
-      </w:r>
-      <w:r>
-        <w:t xml:space="preserve">though CHF-hedged UCITS equivalents exist). "Market-investable" ≠ "Swiss-retail accessible" —</w:t>
+        <w:t xml:space="preserve">(US ETFs such as HYG/EMB require authorisation to be offered to non-qualified Swiss investors).</w:t>
+      </w:r>
+      <w:r>
+        <w:t xml:space="preserve"> </w:t>
+      </w:r>
+      <w:r>
+        <w:t xml:space="preserve">For EM debt a CHF-hedged UCITS vehicle is directly available (e.g. iShares J.P. Morgan $ EM Bond</w:t>
+      </w:r>
+      <w:r>
+        <w:t xml:space="preserve"> </w:t>
+      </w:r>
+      <w:r>
+        <w:t xml:space="preserve">CHF-Hedged UCITS ETF,</w:t>
+      </w:r>
+      <w:r>
+        <w:t xml:space="preserve"> </w:t>
+      </w:r>
+      <w:r>
+        <w:rPr>
+          <w:iCs/>
+          <w:i/>
+        </w:rPr>
+        <w:t xml:space="preserve">EMBC</w:t>
+      </w:r>
+      <w:r>
+        <w:t xml:space="preserve">); for US high yield the CHF-hedged UCITS listing is less</w:t>
+      </w:r>
+      <w:r>
+        <w:t xml:space="preserve"> </w:t>
+      </w:r>
+      <w:r>
+        <w:t xml:space="preserve">standardised, so Swiss implementation of the HY leg requires an appropriate local/UCITS vehicle</w:t>
+      </w:r>
+      <w:r>
+        <w:t xml:space="preserve"> </w:t>
+      </w:r>
+      <w:r>
+        <w:t xml:space="preserve">(e.g. a CHF-hedged global-HY UCITS) rather than a like-for-like HYG hedge share.</w:t>
+      </w:r>
+      <w:r>
+        <w:t xml:space="preserve"> </w:t>
+      </w:r>
+      <w:r>
+        <w:t xml:space="preserve">"Market-investable" ≠ "Swiss-retail accessible" —</w:t>
       </w:r>
       <w:r>
         <w:t xml:space="preserve"> </w:t>
@@ -1900,7 +1987,7 @@
               <w:jc w:val="left"/>
             </w:pPr>
             <w:r>
-              <w:t xml:space="preserve">via CHF-hedged UCITS</w:t>
+              <w:t xml:space="preserve">via CHF-hedged global-HY UCITS</w:t>
             </w:r>
           </w:p>
         </w:tc>
@@ -1986,7 +2073,7 @@
               <w:jc w:val="left"/>
             </w:pPr>
             <w:r>
-              <w:t xml:space="preserve">via CHF-hedged UCITS</w:t>
+              <w:t xml:space="preserve">via CHF-hedged UCITS (EMBC)</w:t>
             </w:r>
           </w:p>
         </w:tc>
@@ -2625,13 +2712,19 @@
         <w:t xml:space="preserve"> </w:t>
       </w:r>
       <w:r>
-        <w:t xml:space="preserve">that satisfy this rule with full 2008 history; convertibles are a candidate class analysed</w:t>
-      </w:r>
-      <w:r>
-        <w:t xml:space="preserve"> </w:t>
-      </w:r>
-      <w:r>
-        <w:t xml:space="preserve">separately (no consistent pre-2009 history).</w:t>
+        <w:t xml:space="preserve">with histories beginning in 2008 that satisfy this rule (EM debt begins 2008-02, which fixes the</w:t>
+      </w:r>
+      <w:r>
+        <w:t xml:space="preserve"> </w:t>
+      </w:r>
+      <w:r>
+        <w:t xml:space="preserve">common sample window for every book at 2008-02 – 2026-06); convertibles are a candidate class</w:t>
+      </w:r>
+      <w:r>
+        <w:t xml:space="preserve"> </w:t>
+      </w:r>
+      <w:r>
+        <w:t xml:space="preserve">analysed separately (no consistent pre-2009 history).</w:t>
       </w:r>
     </w:p>
     <w:p>
@@ -2898,19 +2991,19 @@
               <w:jc w:val="left"/>
             </w:pPr>
             <w:r>
-              <w:t xml:space="preserve">+4.0%</w:t>
-            </w:r>
-          </w:p>
-        </w:tc>
-        <w:tc>
-          <w:tcPr/>
-          <w:p>
-            <w:pPr>
-              <w:pStyle w:val="Compact"/>
-              <w:jc w:val="left"/>
-            </w:pPr>
-            <w:r>
-              <w:t xml:space="preserve">+2.5%</w:t>
+              <w:t xml:space="preserve">+4.1%</w:t>
+            </w:r>
+          </w:p>
+        </w:tc>
+        <w:tc>
+          <w:tcPr/>
+          <w:p>
+            <w:pPr>
+              <w:pStyle w:val="Compact"/>
+              <w:jc w:val="left"/>
+            </w:pPr>
+            <w:r>
+              <w:t xml:space="preserve">+2.6%</w:t>
             </w:r>
           </w:p>
         </w:tc>
@@ -2972,7 +3065,7 @@
               <w:jc w:val="left"/>
             </w:pPr>
             <w:r>
-              <w:t xml:space="preserve">−0.8%</w:t>
+              <w:t xml:space="preserve">−0.5%</w:t>
             </w:r>
           </w:p>
         </w:tc>
@@ -2996,7 +3089,7 @@
               <w:jc w:val="left"/>
             </w:pPr>
             <w:r>
-              <w:t xml:space="preserve">−0.6%</w:t>
+              <w:t xml:space="preserve">−0.4%</w:t>
             </w:r>
           </w:p>
         </w:tc>
@@ -3020,7 +3113,7 @@
               <w:jc w:val="left"/>
             </w:pPr>
             <w:r>
-              <w:t xml:space="preserve">−0.8%</w:t>
+              <w:t xml:space="preserve">−0.7%</w:t>
             </w:r>
           </w:p>
         </w:tc>
@@ -3046,19 +3139,19 @@
               <w:jc w:val="left"/>
             </w:pPr>
             <w:r>
-              <w:t xml:space="preserve">+2.9%</w:t>
-            </w:r>
-          </w:p>
-        </w:tc>
-        <w:tc>
-          <w:tcPr/>
-          <w:p>
-            <w:pPr>
-              <w:pStyle w:val="Compact"/>
-              <w:jc w:val="left"/>
-            </w:pPr>
-            <w:r>
-              <w:t xml:space="preserve">+1.5%</w:t>
+              <w:t xml:space="preserve">+1.6%</w:t>
+            </w:r>
+          </w:p>
+        </w:tc>
+        <w:tc>
+          <w:tcPr/>
+          <w:p>
+            <w:pPr>
+              <w:pStyle w:val="Compact"/>
+              <w:jc w:val="left"/>
+            </w:pPr>
+            <w:r>
+              <w:t xml:space="preserve">+0.9%</w:t>
             </w:r>
           </w:p>
         </w:tc>
@@ -3074,31 +3167,31 @@
                 <w:bCs/>
                 <w:b/>
               </w:rPr>
-              <w:t xml:space="preserve">−2.0%</w:t>
-            </w:r>
-          </w:p>
-        </w:tc>
-        <w:tc>
-          <w:tcPr/>
-          <w:p>
-            <w:pPr>
-              <w:pStyle w:val="Compact"/>
-              <w:jc w:val="left"/>
-            </w:pPr>
-            <w:r>
-              <w:t xml:space="preserve">−0.8%</w:t>
-            </w:r>
-          </w:p>
-        </w:tc>
-        <w:tc>
-          <w:tcPr/>
-          <w:p>
-            <w:pPr>
-              <w:pStyle w:val="Compact"/>
-              <w:jc w:val="left"/>
-            </w:pPr>
-            <w:r>
-              <w:t xml:space="preserve">+1.2%</w:t>
+              <w:t xml:space="preserve">−2.9%</w:t>
+            </w:r>
+          </w:p>
+        </w:tc>
+        <w:tc>
+          <w:tcPr/>
+          <w:p>
+            <w:pPr>
+              <w:pStyle w:val="Compact"/>
+              <w:jc w:val="left"/>
+            </w:pPr>
+            <w:r>
+              <w:t xml:space="preserve">−1.2%</w:t>
+            </w:r>
+          </w:p>
+        </w:tc>
+        <w:tc>
+          <w:tcPr/>
+          <w:p>
+            <w:pPr>
+              <w:pStyle w:val="Compact"/>
+              <w:jc w:val="left"/>
+            </w:pPr>
+            <w:r>
+              <w:t xml:space="preserve">+1.0%</w:t>
             </w:r>
           </w:p>
         </w:tc>
@@ -3124,43 +3217,43 @@
               <w:jc w:val="left"/>
             </w:pPr>
             <w:r>
-              <w:t xml:space="preserve">+2.4%</w:t>
-            </w:r>
-          </w:p>
-        </w:tc>
-        <w:tc>
-          <w:tcPr/>
-          <w:p>
-            <w:pPr>
-              <w:pStyle w:val="Compact"/>
-              <w:jc w:val="left"/>
-            </w:pPr>
-            <w:r>
-              <w:t xml:space="preserve">+1.9%</w:t>
-            </w:r>
-          </w:p>
-        </w:tc>
-        <w:tc>
-          <w:tcPr/>
-          <w:p>
-            <w:pPr>
-              <w:pStyle w:val="Compact"/>
-              <w:jc w:val="left"/>
-            </w:pPr>
-            <w:r>
-              <w:t xml:space="preserve">−0.3%</w:t>
-            </w:r>
-          </w:p>
-        </w:tc>
-        <w:tc>
-          <w:tcPr/>
-          <w:p>
-            <w:pPr>
-              <w:pStyle w:val="Compact"/>
-              <w:jc w:val="left"/>
-            </w:pPr>
-            <w:r>
-              <w:t xml:space="preserve">+0.5%</w:t>
+              <w:t xml:space="preserve">+2.7%</w:t>
+            </w:r>
+          </w:p>
+        </w:tc>
+        <w:tc>
+          <w:tcPr/>
+          <w:p>
+            <w:pPr>
+              <w:pStyle w:val="Compact"/>
+              <w:jc w:val="left"/>
+            </w:pPr>
+            <w:r>
+              <w:t xml:space="preserve">+2.0%</w:t>
+            </w:r>
+          </w:p>
+        </w:tc>
+        <w:tc>
+          <w:tcPr/>
+          <w:p>
+            <w:pPr>
+              <w:pStyle w:val="Compact"/>
+              <w:jc w:val="left"/>
+            </w:pPr>
+            <w:r>
+              <w:t xml:space="preserve">−0.0%</w:t>
+            </w:r>
+          </w:p>
+        </w:tc>
+        <w:tc>
+          <w:tcPr/>
+          <w:p>
+            <w:pPr>
+              <w:pStyle w:val="Compact"/>
+              <w:jc w:val="left"/>
+            </w:pPr>
+            <w:r>
+              <w:t xml:space="preserve">+0.6%</w:t>
             </w:r>
           </w:p>
         </w:tc>
@@ -3180,7 +3273,93 @@
     </w:tbl>
     <w:p>
       <w:pPr>
-        <w:pStyle w:val="BodyText"/>
+        <w:pStyle w:val="BlockText"/>
+      </w:pPr>
+      <w:r>
+        <w:rPr>
+          <w:bCs/>
+          <w:b/>
+        </w:rPr>
+        <w:t xml:space="preserve">Global-rate context (secondary).</w:t>
+      </w:r>
+      <w:r>
+        <w:t xml:space="preserve"> </w:t>
+      </w:r>
+      <w:r>
+        <w:t xml:space="preserve">The four regimes are classified on the</w:t>
+      </w:r>
+      <w:r>
+        <w:t xml:space="preserve"> </w:t>
+      </w:r>
+      <w:r>
+        <w:rPr>
+          <w:bCs/>
+          <w:b/>
+        </w:rPr>
+        <w:t xml:space="preserve">SNB policy path</w:t>
+      </w:r>
+      <w:r>
+        <w:t xml:space="preserve"> </w:t>
+      </w:r>
+      <w:r>
+        <w:t xml:space="preserve">— the correct primary lens for a CHF-based Swiss investor with a Swiss local-bond allocation and</w:t>
+      </w:r>
+      <w:r>
+        <w:t xml:space="preserve"> </w:t>
+      </w:r>
+      <w:r>
+        <w:t xml:space="preserve">a CHF cash benchmark. Because the World-Bond sleeve is 25.2% of AP5 and internationally exposed,</w:t>
+      </w:r>
+      <w:r>
+        <w:t xml:space="preserve"> </w:t>
+      </w:r>
+      <w:r>
+        <w:t xml:space="preserve">we report the</w:t>
+      </w:r>
+      <w:r>
+        <w:t xml:space="preserve"> </w:t>
+      </w:r>
+      <w:r>
+        <w:rPr>
+          <w:bCs/>
+          <w:b/>
+        </w:rPr>
+        <w:t xml:space="preserve">Fed policy rate</w:t>
+      </w:r>
+      <w:r>
+        <w:t xml:space="preserve"> </w:t>
+      </w:r>
+      <w:r>
+        <w:t xml:space="preserve">at each regime's boundaries as secondary context (not a</w:t>
+      </w:r>
+      <w:r>
+        <w:t xml:space="preserve"> </w:t>
+      </w:r>
+      <w:r>
+        <w:t xml:space="preserve">reclassification): R1 SNB +2.75%→−0.25% / Fed 3.00%→0.12%; R2 SNB −0.75% flat / Fed 0.12%→0.88%;</w:t>
+      </w:r>
+      <w:r>
+        <w:t xml:space="preserve"> </w:t>
+      </w:r>
+      <w:r>
+        <w:t xml:space="preserve">R3 SNB −0.25%→+1.75% / Fed 1.62%→5.38%; R4 SNB +1.50%→0.00% / Fed 5.38%→3.62%. SNB and Fed cycles</w:t>
+      </w:r>
+      <w:r>
+        <w:t xml:space="preserve"> </w:t>
+      </w:r>
+      <w:r>
+        <w:t xml:space="preserve">broadly co-move but with different timing and amplitude — which is precisely why the world-bond</w:t>
+      </w:r>
+      <w:r>
+        <w:t xml:space="preserve"> </w:t>
+      </w:r>
+      <w:r>
+        <w:t xml:space="preserve">tranche (Global Aggregate) behaves differently from the Swiss tranche within the same SNB regime.</w:t>
+      </w:r>
+    </w:p>
+    <w:p>
+      <w:pPr>
+        <w:pStyle w:val="FirstParagraph"/>
       </w:pPr>
       <w:r>
         <w:t xml:space="preserve">Bond performance was</w:t>
@@ -3210,13 +3389,46 @@
         <w:t xml:space="preserve">negative-rate (R2) and tightening (R3) regimes</w:t>
       </w:r>
       <w:r>
-        <w:t xml:space="preserve">. The broad-vs-short contrast in R3 (−2.0% vs</w:t>
-      </w:r>
-      <w:r>
-        <w:t xml:space="preserve"> </w:t>
-      </w:r>
-      <w:r>
-        <w:t xml:space="preserve">−0.8%) is</w:t>
+        <w:t xml:space="preserve">. In the 2022–24 tightening the</w:t>
+      </w:r>
+      <w:r>
+        <w:t xml:space="preserve"> </w:t>
+      </w:r>
+      <w:r>
+        <w:rPr>
+          <w:bCs/>
+          <w:b/>
+        </w:rPr>
+        <w:t xml:space="preserve">broad global</w:t>
+      </w:r>
+      <w:r>
+        <w:rPr>
+          <w:bCs/>
+          <w:b/>
+        </w:rPr>
+        <w:t xml:space="preserve"> </w:t>
+      </w:r>
+      <w:r>
+        <w:rPr>
+          <w:bCs/>
+          <w:b/>
+        </w:rPr>
+        <w:t xml:space="preserve">bond tranche was hit hardest (−2.9%/yr) while Swiss bonds stayed positive (+1.6%/yr)</w:t>
+      </w:r>
+      <w:r>
+        <w:t xml:space="preserve">, and within</w:t>
+      </w:r>
+      <w:r>
+        <w:t xml:space="preserve"> </w:t>
+      </w:r>
+      <w:r>
+        <w:t xml:space="preserve">the global tranche the short-duration series lost far less than the broad one (−1.2% vs −2.9%) —</w:t>
+      </w:r>
+      <w:r>
+        <w:t xml:space="preserve"> </w:t>
+      </w:r>
+      <w:r>
+        <w:t xml:space="preserve">a pattern</w:t>
       </w:r>
       <w:r>
         <w:t xml:space="preserve"> </w:t>
@@ -3462,7 +3674,7 @@
               <w:jc w:val="left"/>
             </w:pPr>
             <w:r>
-              <w:t xml:space="preserve">3.40%</w:t>
+              <w:t xml:space="preserve">3.55%</w:t>
             </w:r>
           </w:p>
         </w:tc>
@@ -3486,31 +3698,31 @@
               <w:jc w:val="left"/>
             </w:pPr>
             <w:r>
-              <w:t xml:space="preserve">0.46</w:t>
-            </w:r>
-          </w:p>
-        </w:tc>
-        <w:tc>
-          <w:tcPr/>
-          <w:p>
-            <w:pPr>
-              <w:pStyle w:val="Compact"/>
-              <w:jc w:val="left"/>
-            </w:pPr>
-            <w:r>
-              <w:t xml:space="preserve">−20.6%</w:t>
-            </w:r>
-          </w:p>
-        </w:tc>
-        <w:tc>
-          <w:tcPr/>
-          <w:p>
-            <w:pPr>
-              <w:pStyle w:val="Compact"/>
-              <w:jc w:val="left"/>
-            </w:pPr>
-            <w:r>
-              <w:t xml:space="preserve">−5.1%</w:t>
+              <w:t xml:space="preserve">0.48</w:t>
+            </w:r>
+          </w:p>
+        </w:tc>
+        <w:tc>
+          <w:tcPr/>
+          <w:p>
+            <w:pPr>
+              <w:pStyle w:val="Compact"/>
+              <w:jc w:val="left"/>
+            </w:pPr>
+            <w:r>
+              <w:t xml:space="preserve">−20.4%</w:t>
+            </w:r>
+          </w:p>
+        </w:tc>
+        <w:tc>
+          <w:tcPr/>
+          <w:p>
+            <w:pPr>
+              <w:pStyle w:val="Compact"/>
+              <w:jc w:val="left"/>
+            </w:pPr>
+            <w:r>
+              <w:t xml:space="preserve">−5.2%</w:t>
             </w:r>
           </w:p>
         </w:tc>
@@ -3536,7 +3748,7 @@
               <w:jc w:val="left"/>
             </w:pPr>
             <w:r>
-              <w:t xml:space="preserve">3.65%</w:t>
+              <w:t xml:space="preserve">3.71%</w:t>
             </w:r>
           </w:p>
         </w:tc>
@@ -3572,7 +3784,7 @@
               <w:jc w:val="left"/>
             </w:pPr>
             <w:r>
-              <w:t xml:space="preserve">−21.8%</w:t>
+              <w:t xml:space="preserve">−21.9%</w:t>
             </w:r>
           </w:p>
         </w:tc>
@@ -3610,7 +3822,7 @@
               <w:jc w:val="left"/>
             </w:pPr>
             <w:r>
-              <w:t xml:space="preserve">3.91%</w:t>
+              <w:t xml:space="preserve">3.95%</w:t>
             </w:r>
           </w:p>
         </w:tc>
@@ -3634,7 +3846,7 @@
               <w:jc w:val="left"/>
             </w:pPr>
             <w:r>
-              <w:t xml:space="preserve">0.47</w:t>
+              <w:t xml:space="preserve">0.48</w:t>
             </w:r>
           </w:p>
         </w:tc>
@@ -3684,7 +3896,7 @@
               <w:jc w:val="left"/>
             </w:pPr>
             <w:r>
-              <w:t xml:space="preserve">4.27%</w:t>
+              <w:t xml:space="preserve">4.28%</w:t>
             </w:r>
           </w:p>
         </w:tc>
@@ -3720,7 +3932,7 @@
               <w:jc w:val="left"/>
             </w:pPr>
             <w:r>
-              <w:t xml:space="preserve">−27.9%</w:t>
+              <w:t xml:space="preserve">−28.0%</w:t>
             </w:r>
           </w:p>
         </w:tc>
@@ -3747,27 +3959,110 @@
           <w:bCs/>
           <w:b/>
         </w:rPr>
-        <w:t xml:space="preserve">More replacement → higher return, higher volatility, deeper drawdown and tail loss, roughly</w:t>
-      </w:r>
-      <w:r>
-        <w:rPr>
-          <w:bCs/>
-          <w:b/>
-        </w:rPr>
-        <w:t xml:space="preserve"> </w:t>
-      </w:r>
-      <w:r>
-        <w:rPr>
-          <w:bCs/>
-          <w:b/>
-        </w:rPr>
-        <w:t xml:space="preserve">unchanged Sharpe.</w:t>
-      </w:r>
-      <w:r>
-        <w:t xml:space="preserve"> </w:t>
-      </w:r>
-      <w:r>
-        <w:t xml:space="preserve">That clean monotonic trade-off is the central finding.</w:t>
+        <w:t xml:space="preserve">More replacement → higher return, higher volatility, deeper drawdown and tail loss, with Sharpe</w:t>
+      </w:r>
+      <w:r>
+        <w:rPr>
+          <w:bCs/>
+          <w:b/>
+        </w:rPr>
+        <w:t xml:space="preserve"> </w:t>
+      </w:r>
+      <w:r>
+        <w:rPr>
+          <w:bCs/>
+          <w:b/>
+        </w:rPr>
+        <w:t xml:space="preserve">roughly flat (~0.48) up to ~50% and then declining to ~0.46 at full replacement.</w:t>
+      </w:r>
+      <w:r>
+        <w:t xml:space="preserve"> </w:t>
+      </w:r>
+      <w:r>
+        <w:t xml:space="preserve">That clean</w:t>
+      </w:r>
+      <w:r>
+        <w:t xml:space="preserve"> </w:t>
+      </w:r>
+      <w:r>
+        <w:t xml:space="preserve">monotonic risk–return trade-off is the central finding. Under this (primary) category-level</w:t>
+      </w:r>
+      <w:r>
+        <w:t xml:space="preserve"> </w:t>
+      </w:r>
+      <w:r>
+        <w:t xml:space="preserve">specification the point-estimate Sharpe is</w:t>
+      </w:r>
+      <w:r>
+        <w:t xml:space="preserve"> </w:t>
+      </w:r>
+      <w:r>
+        <w:rPr>
+          <w:bCs/>
+          <w:b/>
+        </w:rPr>
+        <w:t xml:space="preserve">highest at AP5 / low replacement and never rises</w:t>
+      </w:r>
+      <w:r>
+        <w:rPr>
+          <w:bCs/>
+          <w:b/>
+        </w:rPr>
+        <w:t xml:space="preserve"> </w:t>
+      </w:r>
+      <w:r>
+        <w:rPr>
+          <w:bCs/>
+          <w:b/>
+        </w:rPr>
+        <w:t xml:space="preserve">above it</w:t>
+      </w:r>
+      <w:r>
+        <w:t xml:space="preserve"> </w:t>
+      </w:r>
+      <w:r>
+        <w:t xml:space="preserve">— i.e. there is</w:t>
+      </w:r>
+      <w:r>
+        <w:t xml:space="preserve"> </w:t>
+      </w:r>
+      <w:r>
+        <w:rPr>
+          <w:bCs/>
+          <w:b/>
+        </w:rPr>
+        <w:t xml:space="preserve">no partial-replacement Sharpe peak</w:t>
+      </w:r>
+      <w:r>
+        <w:t xml:space="preserve">; low-to-moderate replacement is</w:t>
+      </w:r>
+      <w:r>
+        <w:t xml:space="preserve"> </w:t>
+      </w:r>
+      <w:r>
+        <w:t xml:space="preserve">approximately</w:t>
+      </w:r>
+      <w:r>
+        <w:t xml:space="preserve"> </w:t>
+      </w:r>
+      <w:r>
+        <w:rPr>
+          <w:iCs/>
+          <w:i/>
+        </w:rPr>
+        <w:t xml:space="preserve">Sharpe-neutral</w:t>
+      </w:r>
+      <w:r>
+        <w:t xml:space="preserve"> </w:t>
+      </w:r>
+      <w:r>
+        <w:t xml:space="preserve">while adding return-and-risk, and full replacement is weakly worse</w:t>
+      </w:r>
+      <w:r>
+        <w:t xml:space="preserve"> </w:t>
+      </w:r>
+      <w:r>
+        <w:t xml:space="preserve">on Sharpe and clearly worse on downside.</w:t>
       </w:r>
     </w:p>
     <w:bookmarkEnd w:id="26"/>
@@ -3930,31 +4225,31 @@
               <w:jc w:val="left"/>
             </w:pPr>
             <w:r>
-              <w:t xml:space="preserve">80%</w:t>
-            </w:r>
-          </w:p>
-        </w:tc>
-        <w:tc>
-          <w:tcPr/>
-          <w:p>
-            <w:pPr>
-              <w:pStyle w:val="Compact"/>
-              <w:jc w:val="left"/>
-            </w:pPr>
-            <w:r>
-              <w:t xml:space="preserve">[−0.03, +0.03] · 43%</w:t>
-            </w:r>
-          </w:p>
-        </w:tc>
-        <w:tc>
-          <w:tcPr/>
-          <w:p>
-            <w:pPr>
-              <w:pStyle w:val="Compact"/>
-              <w:jc w:val="left"/>
-            </w:pPr>
-            <w:r>
-              <w:t xml:space="preserve">81%</w:t>
+              <w:t xml:space="preserve">84%</w:t>
+            </w:r>
+          </w:p>
+        </w:tc>
+        <w:tc>
+          <w:tcPr/>
+          <w:p>
+            <w:pPr>
+              <w:pStyle w:val="Compact"/>
+              <w:jc w:val="left"/>
+            </w:pPr>
+            <w:r>
+              <w:t xml:space="preserve">[−0.03, +0.03] · 45%</w:t>
+            </w:r>
+          </w:p>
+        </w:tc>
+        <w:tc>
+          <w:tcPr/>
+          <w:p>
+            <w:pPr>
+              <w:pStyle w:val="Compact"/>
+              <w:jc w:val="left"/>
+            </w:pPr>
+            <w:r>
+              <w:t xml:space="preserve">83%</w:t>
             </w:r>
           </w:p>
         </w:tc>
@@ -4008,7 +4303,7 @@
               <w:jc w:val="left"/>
             </w:pPr>
             <w:r>
-              <w:t xml:space="preserve">[−0.07, +0.07] · 44%</w:t>
+              <w:t xml:space="preserve">[−0.07, +0.07] · 42%</w:t>
             </w:r>
           </w:p>
         </w:tc>
@@ -4058,19 +4353,19 @@
               <w:jc w:val="left"/>
             </w:pPr>
             <w:r>
-              <w:t xml:space="preserve">83%</w:t>
-            </w:r>
-          </w:p>
-        </w:tc>
-        <w:tc>
-          <w:tcPr/>
-          <w:p>
-            <w:pPr>
-              <w:pStyle w:val="Compact"/>
-              <w:jc w:val="left"/>
-            </w:pPr>
-            <w:r>
-              <w:t xml:space="preserve">[−0.13, +0.11] · 39%</w:t>
+              <w:t xml:space="preserve">82%</w:t>
+            </w:r>
+          </w:p>
+        </w:tc>
+        <w:tc>
+          <w:tcPr/>
+          <w:p>
+            <w:pPr>
+              <w:pStyle w:val="Compact"/>
+              <w:jc w:val="left"/>
+            </w:pPr>
+            <w:r>
+              <w:t xml:space="preserve">[−0.14, +0.11] · 36%</w:t>
             </w:r>
           </w:p>
         </w:tc>
@@ -4121,7 +4416,7 @@
         <w:t xml:space="preserve"> </w:t>
       </w:r>
       <w:r>
-        <w:t xml:space="preserve">— P(ΔCAGR&gt;0) ≈ 80–84%, CI includes zero (H1</w:t>
+        <w:t xml:space="preserve">— P(ΔCAGR&gt;0) ≈ 82–84%, CI includes zero (H1</w:t>
       </w:r>
       <w:r>
         <w:t xml:space="preserve"> </w:t>
@@ -4149,7 +4444,7 @@
         <w:t xml:space="preserve"> </w:t>
       </w:r>
       <w:r>
-        <w:t xml:space="preserve">ΔSharpe CI straddles 0). Drawdown</w:t>
+        <w:t xml:space="preserve">ΔSharpe CI straddles 0, and P(ΔSharpe&gt;0) is ≤ 45% throughout — the point estimate slightly</w:t>
       </w:r>
       <w:r>
         <w:t xml:space="preserve"> </w:t>
@@ -4159,47 +4454,10 @@
           <w:iCs/>
           <w:i/>
         </w:rPr>
-        <w:t xml:space="preserve">favours</w:t>
-      </w:r>
-      <w:r>
-        <w:t xml:space="preserve"> </w:t>
-      </w:r>
-      <w:r>
-        <w:t xml:space="preserve">worse but its 95% CI still includes zero (H2a</w:t>
-      </w:r>
-      <w:r>
-        <w:t xml:space="preserve"> </w:t>
-      </w:r>
-      <w:r>
-        <w:t xml:space="preserve">suggestive).</w:t>
-      </w:r>
-      <w:r>
-        <w:t xml:space="preserve"> </w:t>
-      </w:r>
-      <w:r>
-        <w:rPr>
-          <w:bCs/>
-          <w:b/>
-        </w:rPr>
-        <w:t xml:space="preserve">Tail loss (CVaR) is the decisive downside result</w:t>
-      </w:r>
-      <w:r>
-        <w:t xml:space="preserve"> </w:t>
-      </w:r>
-      <w:r>
-        <w:t xml:space="preserve">— worse with ≈99–100%</w:t>
-      </w:r>
-      <w:r>
-        <w:t xml:space="preserve"> </w:t>
-      </w:r>
-      <w:r>
-        <w:t xml:space="preserve">probability from a 20% replacement (robust to the 90% vs 95% CVaR threshold and to bootstrap</w:t>
-      </w:r>
-      <w:r>
-        <w:t xml:space="preserve"> </w:t>
-      </w:r>
-      <w:r>
-        <w:t xml:space="preserve">block lengths of 3/6/12 months; H2b strong evidence). The return–risk</w:t>
+        <w:t xml:space="preserve">favours AP5</w:t>
+      </w:r>
+      <w:r>
+        <w:t xml:space="preserve">). Drawdown</w:t>
       </w:r>
       <w:r>
         <w:t xml:space="preserve"> </w:t>
@@ -4209,19 +4467,41 @@
           <w:iCs/>
           <w:i/>
         </w:rPr>
-        <w:t xml:space="preserve">trade-off</w:t>
-      </w:r>
-      <w:r>
-        <w:t xml:space="preserve"> </w:t>
-      </w:r>
-      <w:r>
-        <w:t xml:space="preserve">is real; a</w:t>
-      </w:r>
-      <w:r>
-        <w:t xml:space="preserve"> </w:t>
-      </w:r>
-      <w:r>
-        <w:t xml:space="preserve">Sharpe</w:t>
+        <w:t xml:space="preserve">favours</w:t>
+      </w:r>
+      <w:r>
+        <w:t xml:space="preserve"> </w:t>
+      </w:r>
+      <w:r>
+        <w:t xml:space="preserve">worse but its 95% CI still includes zero (H2a suggestive).</w:t>
+      </w:r>
+      <w:r>
+        <w:t xml:space="preserve"> </w:t>
+      </w:r>
+      <w:r>
+        <w:rPr>
+          <w:bCs/>
+          <w:b/>
+        </w:rPr>
+        <w:t xml:space="preserve">Tail loss (CVaR) is the decisive downside result</w:t>
+      </w:r>
+      <w:r>
+        <w:t xml:space="preserve"> </w:t>
+      </w:r>
+      <w:r>
+        <w:t xml:space="preserve">— worse with ≈99–100% probability from a 20%</w:t>
+      </w:r>
+      <w:r>
+        <w:t xml:space="preserve"> </w:t>
+      </w:r>
+      <w:r>
+        <w:t xml:space="preserve">replacement (robust to the 90% vs 95% CVaR threshold and to bootstrap block lengths of 3/6/12</w:t>
+      </w:r>
+      <w:r>
+        <w:t xml:space="preserve"> </w:t>
+      </w:r>
+      <w:r>
+        <w:t xml:space="preserve">months; H2b strong evidence). The return–risk</w:t>
       </w:r>
       <w:r>
         <w:t xml:space="preserve"> </w:t>
@@ -4231,13 +4511,35 @@
           <w:iCs/>
           <w:i/>
         </w:rPr>
+        <w:t xml:space="preserve">trade-off</w:t>
+      </w:r>
+      <w:r>
+        <w:t xml:space="preserve"> </w:t>
+      </w:r>
+      <w:r>
+        <w:t xml:space="preserve">is real; a Sharpe</w:t>
+      </w:r>
+      <w:r>
+        <w:t xml:space="preserve"> </w:t>
+      </w:r>
+      <w:r>
+        <w:rPr>
+          <w:iCs/>
+          <w:i/>
+        </w:rPr>
         <w:t xml:space="preserve">edge</w:t>
       </w:r>
       <w:r>
         <w:t xml:space="preserve"> </w:t>
       </w:r>
       <w:r>
-        <w:t xml:space="preserve">is not established.</w:t>
+        <w:t xml:space="preserve">is not</w:t>
+      </w:r>
+      <w:r>
+        <w:t xml:space="preserve"> </w:t>
+      </w:r>
+      <w:r>
+        <w:t xml:space="preserve">established.</w:t>
       </w:r>
     </w:p>
     <w:bookmarkEnd w:id="27"/>
@@ -4389,6 +4691,18 @@
                 <w:bCs/>
                 <w:b/>
               </w:rPr>
+              <w:t xml:space="preserve">−6.1%</w:t>
+            </w:r>
+          </w:p>
+        </w:tc>
+        <w:tc>
+          <w:tcPr/>
+          <w:p>
+            <w:pPr>
+              <w:pStyle w:val="Compact"/>
+              <w:jc w:val="left"/>
+            </w:pPr>
+            <w:r>
               <w:t xml:space="preserve">−6.9%</w:t>
             </w:r>
           </w:p>
@@ -4401,18 +4715,6 @@
               <w:jc w:val="left"/>
             </w:pPr>
             <w:r>
-              <w:t xml:space="preserve">−6.9%</w:t>
-            </w:r>
-          </w:p>
-        </w:tc>
-        <w:tc>
-          <w:tcPr/>
-          <w:p>
-            <w:pPr>
-              <w:pStyle w:val="Compact"/>
-              <w:jc w:val="left"/>
-            </w:pPr>
-            <w:r>
               <w:t xml:space="preserve">−8.2%</w:t>
             </w:r>
           </w:p>
@@ -4425,7 +4727,7 @@
               <w:jc w:val="left"/>
             </w:pPr>
             <w:r>
-              <w:t xml:space="preserve">−10.4%</w:t>
+              <w:t xml:space="preserve">−10.3%</w:t>
             </w:r>
           </w:p>
         </w:tc>
@@ -4451,31 +4753,31 @@
               <w:jc w:val="left"/>
             </w:pPr>
             <w:r>
-              <w:t xml:space="preserve">−11.9%</w:t>
-            </w:r>
-          </w:p>
-        </w:tc>
-        <w:tc>
-          <w:tcPr/>
-          <w:p>
-            <w:pPr>
-              <w:pStyle w:val="Compact"/>
-              <w:jc w:val="left"/>
-            </w:pPr>
-            <w:r>
-              <w:t xml:space="preserve">−10.8%</w:t>
-            </w:r>
-          </w:p>
-        </w:tc>
-        <w:tc>
-          <w:tcPr/>
-          <w:p>
-            <w:pPr>
-              <w:pStyle w:val="Compact"/>
-              <w:jc w:val="left"/>
-            </w:pPr>
-            <w:r>
-              <w:t xml:space="preserve">−9.2%</w:t>
+              <w:t xml:space="preserve">−11.7%</w:t>
+            </w:r>
+          </w:p>
+        </w:tc>
+        <w:tc>
+          <w:tcPr/>
+          <w:p>
+            <w:pPr>
+              <w:pStyle w:val="Compact"/>
+              <w:jc w:val="left"/>
+            </w:pPr>
+            <w:r>
+              <w:t xml:space="preserve">−10.6%</w:t>
+            </w:r>
+          </w:p>
+        </w:tc>
+        <w:tc>
+          <w:tcPr/>
+          <w:p>
+            <w:pPr>
+              <w:pStyle w:val="Compact"/>
+              <w:jc w:val="left"/>
+            </w:pPr>
+            <w:r>
+              <w:t xml:space="preserve">−9.0%</w:t>
             </w:r>
           </w:p>
         </w:tc>
@@ -4491,7 +4793,7 @@
                 <w:bCs/>
                 <w:b/>
               </w:rPr>
-              <w:t xml:space="preserve">−6.6%</w:t>
+              <w:t xml:space="preserve">−6.1%</w:t>
             </w:r>
           </w:p>
         </w:tc>
@@ -4517,19 +4819,19 @@
               <w:jc w:val="left"/>
             </w:pPr>
             <w:r>
-              <w:t xml:space="preserve">+0.1%</w:t>
-            </w:r>
-          </w:p>
-        </w:tc>
-        <w:tc>
-          <w:tcPr/>
-          <w:p>
-            <w:pPr>
-              <w:pStyle w:val="Compact"/>
-              <w:jc w:val="left"/>
-            </w:pPr>
-            <w:r>
-              <w:t xml:space="preserve">−0.2%</w:t>
+              <w:t xml:space="preserve">+0.0%</w:t>
+            </w:r>
+          </w:p>
+        </w:tc>
+        <w:tc>
+          <w:tcPr/>
+          <w:p>
+            <w:pPr>
+              <w:pStyle w:val="Compact"/>
+              <w:jc w:val="left"/>
+            </w:pPr>
+            <w:r>
+              <w:t xml:space="preserve">−0.3%</w:t>
             </w:r>
           </w:p>
         </w:tc>
@@ -4686,7 +4988,13 @@
         <w:t xml:space="preserve"> </w:t>
       </w:r>
       <w:r>
-        <w:t xml:space="preserve">conclusion (partial preferred; full deepens downside) is unchanged.</w:t>
+        <w:t xml:space="preserve">conclusion (Sharpe flat-to-declining in replacement; full replacement deepens downside) is</w:t>
+      </w:r>
+      <w:r>
+        <w:t xml:space="preserve"> </w:t>
+      </w:r>
+      <w:r>
+        <w:t xml:space="preserve">unchanged.</w:t>
       </w:r>
     </w:p>
     <w:bookmarkEnd w:id="28"/>
@@ -4762,24 +5070,108 @@
           <w:bCs/>
           <w:b/>
         </w:rPr>
-        <w:t xml:space="preserve">full replacement deepens drawdown and tail loss in every</w:t>
-      </w:r>
-      <w:r>
-        <w:rPr>
-          <w:bCs/>
-          <w:b/>
-        </w:rPr>
-        <w:t xml:space="preserve"> </w:t>
-      </w:r>
-      <w:r>
-        <w:rPr>
-          <w:bCs/>
-          <w:b/>
-        </w:rPr>
-        <w:t xml:space="preserve">single case</w:t>
-      </w:r>
-      <w:r>
-        <w:t xml:space="preserve">. The weaker</w:t>
+        <w:t xml:space="preserve">full replacement deepens drawdown in every single tested</w:t>
+      </w:r>
+      <w:r>
+        <w:rPr>
+          <w:bCs/>
+          <w:b/>
+        </w:rPr>
+        <w:t xml:space="preserve"> </w:t>
+      </w:r>
+      <w:r>
+        <w:rPr>
+          <w:bCs/>
+          <w:b/>
+        </w:rPr>
+        <w:t xml:space="preserve">specification, and worsens CVaR95 in every one as well</w:t>
+      </w:r>
+      <w:r>
+        <w:t xml:space="preserve"> </w:t>
+      </w:r>
+      <w:r>
+        <w:t xml:space="preserve">(the sensitivity matrix now reports</w:t>
+      </w:r>
+      <w:r>
+        <w:t xml:space="preserve"> </w:t>
+      </w:r>
+      <w:r>
+        <w:rPr>
+          <w:rStyle w:val="VerbatimChar"/>
+        </w:rPr>
+        <w:t xml:space="preserve">AP5_CVaR95</w:t>
+      </w:r>
+      <w:r>
+        <w:t xml:space="preserve">,</w:t>
+      </w:r>
+      <w:r>
+        <w:t xml:space="preserve"> </w:t>
+      </w:r>
+      <w:r>
+        <w:rPr>
+          <w:rStyle w:val="VerbatimChar"/>
+        </w:rPr>
+        <w:t xml:space="preserve">repl100_CVaR95</w:t>
+      </w:r>
+      <w:r>
+        <w:t xml:space="preserve"> </w:t>
+      </w:r>
+      <w:r>
+        <w:t xml:space="preserve">and</w:t>
+      </w:r>
+      <w:r>
+        <w:t xml:space="preserve"> </w:t>
+      </w:r>
+      <w:r>
+        <w:rPr>
+          <w:rStyle w:val="VerbatimChar"/>
+        </w:rPr>
+        <w:t xml:space="preserve">full_worse_CVaR95</w:t>
+      </w:r>
+      <w:r>
+        <w:t xml:space="preserve"> </w:t>
+      </w:r>
+      <w:r>
+        <w:t xml:space="preserve">alongside drawdown, and the bootstrap</w:t>
+      </w:r>
+      <w:r>
+        <w:t xml:space="preserve"> </w:t>
+      </w:r>
+      <w:r>
+        <w:t xml:space="preserve">confirms the same tail-loss deterioration with ≈100% probability). Under the primary</w:t>
+      </w:r>
+      <w:r>
+        <w:t xml:space="preserve"> </w:t>
+      </w:r>
+      <w:r>
+        <w:t xml:space="preserve">category-level specification</w:t>
+      </w:r>
+      <w:r>
+        <w:t xml:space="preserve"> </w:t>
+      </w:r>
+      <w:r>
+        <w:rPr>
+          <w:bCs/>
+          <w:b/>
+        </w:rPr>
+        <w:t xml:space="preserve">partial replacement is essentially Sharpe-neutral, not</w:t>
+      </w:r>
+      <w:r>
+        <w:rPr>
+          <w:bCs/>
+          <w:b/>
+        </w:rPr>
+        <w:t xml:space="preserve"> </w:t>
+      </w:r>
+      <w:r>
+        <w:rPr>
+          <w:bCs/>
+          <w:b/>
+        </w:rPr>
+        <w:t xml:space="preserve">Sharpe-superior</w:t>
+      </w:r>
+      <w:r>
+        <w:t xml:space="preserve">: at the base ±8% band, repl-20 Sharpe 0.482 is a hair</w:t>
       </w:r>
       <w:r>
         <w:t xml:space="preserve"> </w:t>
@@ -4789,77 +5181,113 @@
           <w:iCs/>
           <w:i/>
         </w:rPr>
-        <w:t xml:space="preserve">partial-Sharpe-advantage</w:t>
-      </w:r>
-      <w:r>
-        <w:t xml:space="preserve"> </w:t>
-      </w:r>
-      <w:r>
-        <w:t xml:space="preserve">(repl-20 ≥ AP5) holds across all band,</w:t>
-      </w:r>
-      <w:r>
-        <w:t xml:space="preserve"> </w:t>
-      </w:r>
-      <w:r>
-        <w:t xml:space="preserve">cost and splice variations</w:t>
-      </w:r>
-      <w:r>
-        <w:t xml:space="preserve"> </w:t>
-      </w:r>
-      <w:r>
-        <w:rPr>
-          <w:bCs/>
-          <w:b/>
-        </w:rPr>
-        <w:t xml:space="preserve">but disappears in one case: if HY/EM are left unhedged</w:t>
-      </w:r>
-      <w:r>
-        <w:t xml:space="preserve">, partial</w:t>
-      </w:r>
-      <w:r>
-        <w:t xml:space="preserve"> </w:t>
-      </w:r>
-      <w:r>
-        <w:t xml:space="preserve">no longer beats AP5 on Sharpe (repl-20 0.457 vs AP5 0.462) — a further reason the</w:t>
-      </w:r>
-      <w:r>
-        <w:t xml:space="preserve"> </w:t>
-      </w:r>
-      <w:r>
-        <w:rPr>
-          <w:bCs/>
-          <w:b/>
-        </w:rPr>
-        <w:t xml:space="preserve">CHF hedge</w:t>
-      </w:r>
-      <w:r>
-        <w:rPr>
-          <w:bCs/>
-          <w:b/>
-        </w:rPr>
-        <w:t xml:space="preserve"> </w:t>
-      </w:r>
-      <w:r>
-        <w:rPr>
-          <w:bCs/>
-          <w:b/>
-        </w:rPr>
-        <w:t xml:space="preserve">assumption matters</w:t>
-      </w:r>
-      <w:r>
-        <w:t xml:space="preserve">. So the robust, unconditional result is "full replacement worsens</w:t>
-      </w:r>
-      <w:r>
-        <w:t xml:space="preserve"> </w:t>
-      </w:r>
-      <w:r>
-        <w:t xml:space="preserve">downside"; the partial-Sharpe edge is real but hedge-dependent. (The 2010+ sample also changes</w:t>
-      </w:r>
-      <w:r>
-        <w:t xml:space="preserve"> </w:t>
-      </w:r>
-      <w:r>
-        <w:t xml:space="preserve">the period/GFC exposure, so it is a</w:t>
+        <w:t xml:space="preserve">below</w:t>
+      </w:r>
+      <w:r>
+        <w:t xml:space="preserve"> </w:t>
+      </w:r>
+      <w:r>
+        <w:t xml:space="preserve">AP5 0.483, and</w:t>
+      </w:r>
+      <w:r>
+        <w:t xml:space="preserve"> </w:t>
+      </w:r>
+      <w:r>
+        <w:t xml:space="preserve">across the band/cost grid partial replacement is at best tied with AP5 (it edges marginally ahead</w:t>
+      </w:r>
+      <w:r>
+        <w:t xml:space="preserve"> </w:t>
+      </w:r>
+      <w:r>
+        <w:t xml:space="preserve">only at the widest ±15% band and in the 2010+ sub-sample). Leaving HY/EM</w:t>
+      </w:r>
+      <w:r>
+        <w:t xml:space="preserve"> </w:t>
+      </w:r>
+      <w:r>
+        <w:rPr>
+          <w:bCs/>
+          <w:b/>
+        </w:rPr>
+        <w:t xml:space="preserve">unhedged</w:t>
+      </w:r>
+      <w:r>
+        <w:t xml:space="preserve"> </w:t>
+      </w:r>
+      <w:r>
+        <w:t xml:space="preserve">widens the</w:t>
+      </w:r>
+      <w:r>
+        <w:t xml:space="preserve"> </w:t>
+      </w:r>
+      <w:r>
+        <w:t xml:space="preserve">gap the other way (repl-20 0.476 vs AP5 0.483; repl-100 0.442 vs 0.461). So the robust,</w:t>
+      </w:r>
+      <w:r>
+        <w:t xml:space="preserve"> </w:t>
+      </w:r>
+      <w:r>
+        <w:t xml:space="preserve">unconditional result is unchanged and if anything sharper:</w:t>
+      </w:r>
+      <w:r>
+        <w:t xml:space="preserve"> </w:t>
+      </w:r>
+      <w:r>
+        <w:rPr>
+          <w:bCs/>
+          <w:b/>
+        </w:rPr>
+        <w:t xml:space="preserve">full replacement clearly worsens</w:t>
+      </w:r>
+      <w:r>
+        <w:rPr>
+          <w:bCs/>
+          <w:b/>
+        </w:rPr>
+        <w:t xml:space="preserve"> </w:t>
+      </w:r>
+      <w:r>
+        <w:rPr>
+          <w:bCs/>
+          <w:b/>
+        </w:rPr>
+        <w:t xml:space="preserve">downside and does not improve Sharpe; partial replacement buys extra return-and-risk at roughly</w:t>
+      </w:r>
+      <w:r>
+        <w:rPr>
+          <w:bCs/>
+          <w:b/>
+        </w:rPr>
+        <w:t xml:space="preserve"> </w:t>
+      </w:r>
+      <w:r>
+        <w:rPr>
+          <w:bCs/>
+          <w:b/>
+        </w:rPr>
+        <w:t xml:space="preserve">constant Sharpe.</w:t>
+      </w:r>
+      <w:r>
+        <w:t xml:space="preserve"> </w:t>
+      </w:r>
+      <w:r>
+        <w:t xml:space="preserve">There is</w:t>
+      </w:r>
+      <w:r>
+        <w:t xml:space="preserve"> </w:t>
+      </w:r>
+      <w:r>
+        <w:rPr>
+          <w:bCs/>
+          <w:b/>
+        </w:rPr>
+        <w:t xml:space="preserve">no</w:t>
+      </w:r>
+      <w:r>
+        <w:t xml:space="preserve"> </w:t>
+      </w:r>
+      <w:r>
+        <w:t xml:space="preserve">specification in which replacement delivers a</w:t>
       </w:r>
       <w:r>
         <w:t xml:space="preserve"> </w:t>
@@ -4869,6 +5297,22 @@
           <w:iCs/>
           <w:i/>
         </w:rPr>
+        <w:t xml:space="preserve">reliable</w:t>
+      </w:r>
+      <w:r>
+        <w:t xml:space="preserve"> </w:t>
+      </w:r>
+      <w:r>
+        <w:t xml:space="preserve">risk-adjusted advantage. (The 2010+ sample also changes the period/GFC exposure, so it is a</w:t>
+      </w:r>
+      <w:r>
+        <w:t xml:space="preserve"> </w:t>
+      </w:r>
+      <w:r>
+        <w:rPr>
+          <w:iCs/>
+          <w:i/>
+        </w:rPr>
         <w:t xml:space="preserve">sample-window</w:t>
       </w:r>
       <w:r>
@@ -4876,6 +5320,54 @@
       </w:r>
       <w:r>
         <w:t xml:space="preserve">test, not a pure splice test.)</w:t>
+      </w:r>
+    </w:p>
+    <w:p>
+      <w:pPr>
+        <w:pStyle w:val="BodyText"/>
+      </w:pPr>
+      <w:r>
+        <w:t xml:space="preserve">The conclusion is also</w:t>
+      </w:r>
+      <w:r>
+        <w:t xml:space="preserve"> </w:t>
+      </w:r>
+      <w:r>
+        <w:rPr>
+          <w:bCs/>
+          <w:b/>
+        </w:rPr>
+        <w:t xml:space="preserve">robust to the band architecture itself</w:t>
+      </w:r>
+      <w:r>
+        <w:t xml:space="preserve">: monitoring every constituent</w:t>
+      </w:r>
+      <w:r>
+        <w:t xml:space="preserve"> </w:t>
+      </w:r>
+      <w:r>
+        <w:t xml:space="preserve">with its own ±8% band (</w:t>
+      </w:r>
+      <w:r>
+        <w:rPr>
+          <w:rStyle w:val="VerbatimChar"/>
+        </w:rPr>
+        <w:t xml:space="preserve">analysis/robustness_granular_vs_category.csv</w:t>
+      </w:r>
+      <w:r>
+        <w:t xml:space="preserve">) rebalances far more often</w:t>
+      </w:r>
+      <w:r>
+        <w:t xml:space="preserve"> </w:t>
+      </w:r>
+      <w:r>
+        <w:t xml:space="preserve">(≈61–96 vs ≈36–37 triggers) but leaves CAGR/Sharpe/MaxDD essentially identical, confirming the</w:t>
+      </w:r>
+      <w:r>
+        <w:t xml:space="preserve"> </w:t>
+      </w:r>
+      <w:r>
+        <w:t xml:space="preserve">category-level primary specification is not doing the work.</w:t>
       </w:r>
     </w:p>
     <w:bookmarkEnd w:id="30"/>
@@ -5007,19 +5499,27 @@
           <w:bCs/>
           <w:b/>
         </w:rPr>
-        <w:t xml:space="preserve">instrument selection matters as much as the replacement fraction</w:t>
-      </w:r>
-      <w:r>
-        <w:t xml:space="preserve"> </w:t>
-      </w:r>
-      <w:r>
-        <w:t xml:space="preserve">— a</w:t>
-      </w:r>
-      <w:r>
-        <w:t xml:space="preserve"> </w:t>
-      </w:r>
-      <w:r>
-        <w:t xml:space="preserve">motivation for out-of-sample basket selection as future work.</w:t>
+        <w:t xml:space="preserve">instrument selection materially affects the results, in addition to the</w:t>
+      </w:r>
+      <w:r>
+        <w:rPr>
+          <w:bCs/>
+          <w:b/>
+        </w:rPr>
+        <w:t xml:space="preserve"> </w:t>
+      </w:r>
+      <w:r>
+        <w:rPr>
+          <w:bCs/>
+          <w:b/>
+        </w:rPr>
+        <w:t xml:space="preserve">replacement fraction</w:t>
+      </w:r>
+      <w:r>
+        <w:t xml:space="preserve"> </w:t>
+      </w:r>
+      <w:r>
+        <w:t xml:space="preserve">— a motivation for out-of-sample basket selection as future work.</w:t>
       </w:r>
     </w:p>
     <w:bookmarkEnd w:id="31"/>
@@ -5229,45 +5729,51 @@
         <w:t xml:space="preserve"> </w:t>
       </w:r>
       <w:r>
-        <w:t xml:space="preserve">The point estimate of Sharpe peaks around a</w:t>
-      </w:r>
-      <w:r>
-        <w:t xml:space="preserve"> </w:t>
-      </w:r>
-      <w:r>
-        <w:rPr>
-          <w:bCs/>
-          <w:b/>
-        </w:rPr>
-        <w:t xml:space="preserve">20%</w:t>
-      </w:r>
-      <w:r>
-        <w:t xml:space="preserve"> </w:t>
-      </w:r>
-      <w:r>
-        <w:t xml:space="preserve">replacement, but the study does</w:t>
-      </w:r>
-      <w:r>
-        <w:t xml:space="preserve"> </w:t>
-      </w:r>
-      <w:r>
-        <w:rPr>
-          <w:bCs/>
-          <w:b/>
-        </w:rPr>
-        <w:t xml:space="preserve">not statistically distinguish 20%, 30% and 40%</w:t>
-      </w:r>
-      <w:r>
-        <w:t xml:space="preserve"> </w:t>
-      </w:r>
-      <w:r>
-        <w:t xml:space="preserve">—</w:t>
-      </w:r>
-      <w:r>
-        <w:t xml:space="preserve"> </w:t>
-      </w:r>
-      <w:r>
-        <w:t xml:space="preserve">so a low-to-moderate replacement is the most attractive historical</w:t>
+        <w:t xml:space="preserve">Under the category-level specification the Sharpe</w:t>
+      </w:r>
+      <w:r>
+        <w:t xml:space="preserve"> </w:t>
+      </w:r>
+      <w:r>
+        <w:t xml:space="preserve">is essentially</w:t>
+      </w:r>
+      <w:r>
+        <w:t xml:space="preserve"> </w:t>
+      </w:r>
+      <w:r>
+        <w:rPr>
+          <w:bCs/>
+          <w:b/>
+        </w:rPr>
+        <w:t xml:space="preserve">flat (~0.48) from AP5 through ~50% replacement</w:t>
+      </w:r>
+      <w:r>
+        <w:t xml:space="preserve"> </w:t>
+      </w:r>
+      <w:r>
+        <w:t xml:space="preserve">and then declines — there is</w:t>
+      </w:r>
+      <w:r>
+        <w:t xml:space="preserve"> </w:t>
+      </w:r>
+      <w:r>
+        <w:rPr>
+          <w:bCs/>
+          <w:b/>
+        </w:rPr>
+        <w:t xml:space="preserve">no partial-replacement Sharpe peak</w:t>
+      </w:r>
+      <w:r>
+        <w:t xml:space="preserve"> </w:t>
+      </w:r>
+      <w:r>
+        <w:t xml:space="preserve">and no level statistically distinguishable from AP5 on</w:t>
+      </w:r>
+      <w:r>
+        <w:t xml:space="preserve"> </w:t>
+      </w:r>
+      <w:r>
+        <w:t xml:space="preserve">risk-adjusted return. Low-to-moderate replacement is therefore a defensible</w:t>
       </w:r>
       <w:r>
         <w:t xml:space="preserve"> </w:t>
@@ -5280,13 +5786,89 @@
         <w:t xml:space="preserve">compromise</w:t>
       </w:r>
       <w:r>
-        <w:t xml:space="preserve">, not a unique</w:t>
-      </w:r>
-      <w:r>
-        <w:t xml:space="preserve"> </w:t>
-      </w:r>
-      <w:r>
-        <w:t xml:space="preserve">optimum.</w:t>
+        <w:t xml:space="preserve"> </w:t>
+      </w:r>
+      <w:r>
+        <w:t xml:space="preserve">that</w:t>
+      </w:r>
+      <w:r>
+        <w:t xml:space="preserve"> </w:t>
+      </w:r>
+      <w:r>
+        <w:t xml:space="preserve">adds return-and-risk at roughly constant Sharpe,</w:t>
+      </w:r>
+      <w:r>
+        <w:t xml:space="preserve"> </w:t>
+      </w:r>
+      <w:r>
+        <w:rPr>
+          <w:bCs/>
+          <w:b/>
+        </w:rPr>
+        <w:t xml:space="preserve">not</w:t>
+      </w:r>
+      <w:r>
+        <w:t xml:space="preserve"> </w:t>
+      </w:r>
+      <w:r>
+        <w:t xml:space="preserve">a risk-adjusted improvement and</w:t>
+      </w:r>
+      <w:r>
+        <w:t xml:space="preserve"> </w:t>
+      </w:r>
+      <w:r>
+        <w:rPr>
+          <w:bCs/>
+          <w:b/>
+        </w:rPr>
+        <w:t xml:space="preserve">not</w:t>
+      </w:r>
+      <w:r>
+        <w:t xml:space="preserve"> </w:t>
+      </w:r>
+      <w:r>
+        <w:t xml:space="preserve">a unique optimum. If the goal is unchanged risk-adjusted performance with more return (and the</w:t>
+      </w:r>
+      <w:r>
+        <w:t xml:space="preserve"> </w:t>
+      </w:r>
+      <w:r>
+        <w:t xml:space="preserve">investor accepts the deeper tail loss), a low replacement fraction is the honest sweet spot;</w:t>
+      </w:r>
+      <w:r>
+        <w:t xml:space="preserve"> </w:t>
+      </w:r>
+      <w:r>
+        <w:t xml:space="preserve">if the goal is to</w:t>
+      </w:r>
+      <w:r>
+        <w:t xml:space="preserve"> </w:t>
+      </w:r>
+      <w:r>
+        <w:rPr>
+          <w:iCs/>
+          <w:i/>
+        </w:rPr>
+        <w:t xml:space="preserve">improve</w:t>
+      </w:r>
+      <w:r>
+        <w:t xml:space="preserve"> </w:t>
+      </w:r>
+      <w:r>
+        <w:t xml:space="preserve">Sharpe, the evidence supports</w:t>
+      </w:r>
+      <w:r>
+        <w:t xml:space="preserve"> </w:t>
+      </w:r>
+      <w:r>
+        <w:rPr>
+          <w:bCs/>
+          <w:b/>
+        </w:rPr>
+        <w:t xml:space="preserve">no replacement</w:t>
+      </w:r>
+      <w:r>
+        <w:t xml:space="preserve">.</w:t>
       </w:r>
     </w:p>
     <w:p>
@@ -5352,6 +5934,118 @@
       </w:pPr>
       <w:r>
         <w:t xml:space="preserve">Instrument selection matters (§8), but should be validated out-of-sample before use.</w:t>
+      </w:r>
+    </w:p>
+    <w:p>
+      <w:pPr>
+        <w:pStyle w:val="FirstParagraph"/>
+      </w:pPr>
+      <w:r>
+        <w:rPr>
+          <w:bCs/>
+          <w:b/>
+        </w:rPr>
+        <w:t xml:space="preserve">Framing.</w:t>
+      </w:r>
+      <w:r>
+        <w:t xml:space="preserve"> </w:t>
+      </w:r>
+      <w:r>
+        <w:t xml:space="preserve">The monotone chain the data show —</w:t>
+      </w:r>
+      <w:r>
+        <w:t xml:space="preserve"> </w:t>
+      </w:r>
+      <w:r>
+        <w:rPr>
+          <w:iCs/>
+          <w:i/>
+        </w:rPr>
+        <w:t xml:space="preserve">more replacement → more return → more volatility</w:t>
+      </w:r>
+      <w:r>
+        <w:rPr>
+          <w:iCs/>
+          <w:i/>
+        </w:rPr>
+        <w:t xml:space="preserve"> </w:t>
+      </w:r>
+      <w:r>
+        <w:rPr>
+          <w:iCs/>
+          <w:i/>
+        </w:rPr>
+        <w:t xml:space="preserve">→ more tail loss, with no reliable Sharpe gain</w:t>
+      </w:r>
+      <w:r>
+        <w:t xml:space="preserve"> </w:t>
+      </w:r>
+      <w:r>
+        <w:t xml:space="preserve">— is not the signature of discovering a superior</w:t>
+      </w:r>
+      <w:r>
+        <w:t xml:space="preserve"> </w:t>
+      </w:r>
+      <w:r>
+        <w:t xml:space="preserve">defensive asset class; it is the signature of</w:t>
+      </w:r>
+      <w:r>
+        <w:t xml:space="preserve"> </w:t>
+      </w:r>
+      <w:r>
+        <w:rPr>
+          <w:bCs/>
+          <w:b/>
+        </w:rPr>
+        <w:t xml:space="preserve">spending more of the portfolio's risk budget</w:t>
+      </w:r>
+      <w:r>
+        <w:t xml:space="preserve">.</w:t>
+      </w:r>
+      <w:r>
+        <w:t xml:space="preserve"> </w:t>
+      </w:r>
+      <w:r>
+        <w:t xml:space="preserve">Bond replacement should therefore be interpreted as a</w:t>
+      </w:r>
+      <w:r>
+        <w:t xml:space="preserve"> </w:t>
+      </w:r>
+      <w:r>
+        <w:rPr>
+          <w:bCs/>
+          <w:b/>
+        </w:rPr>
+        <w:t xml:space="preserve">strategic reallocation of defensive risk</w:t>
+      </w:r>
+      <w:r>
+        <w:rPr>
+          <w:bCs/>
+          <w:b/>
+        </w:rPr>
+        <w:t xml:space="preserve"> </w:t>
+      </w:r>
+      <w:r>
+        <w:rPr>
+          <w:bCs/>
+          <w:b/>
+        </w:rPr>
+        <w:t xml:space="preserve">rather than as a search for a one-for-one bond substitute</w:t>
+      </w:r>
+      <w:r>
+        <w:t xml:space="preserve">: the decision is how much crash- and</w:t>
+      </w:r>
+      <w:r>
+        <w:t xml:space="preserve"> </w:t>
+      </w:r>
+      <w:r>
+        <w:t xml:space="preserve">duration-protection the investor is willing to trade for carry and inflation exposure, not</w:t>
+      </w:r>
+      <w:r>
+        <w:t xml:space="preserve"> </w:t>
+      </w:r>
+      <w:r>
+        <w:t xml:space="preserve">whether some alternative "beats" bonds outright.</w:t>
       </w:r>
     </w:p>
     <w:bookmarkEnd w:id="32"/>

</xml_diff>

<commit_message>
Regenerate outputs from 223f906 (manifest lineage + rebuilt DOCX)
Outputs-only commit for the audit-5 QA sync. No analytical code changed, so all CSVs
and figures are byte-identical to the previous round; only the manifest commit-lineage
fields and the rebuilt Word documents differ. Manifest generating_commit = 223f906.

Co-Authored-By: Claude Opus 4.8 <noreply@anthropic.com>
Claude-Session: https://claude.ai/code/session_01BpRuhc2aBcap5ePk6Ra9LE
</commit_message>
<xml_diff>
--- a/reports/docx/Bond_replacement_full_report_EN.docx
+++ b/reports/docx/Bond_replacement_full_report_EN.docx
@@ -5346,7 +5346,19 @@
         <w:t xml:space="preserve"> </w:t>
       </w:r>
       <w:r>
-        <w:t xml:space="preserve">with its own ±8% band (</w:t>
+        <w:t xml:space="preserve">with its own ±8% band rebalances far more often but leaves CAGR/Sharpe/MaxDD essentially</w:t>
+      </w:r>
+      <w:r>
+        <w:t xml:space="preserve"> </w:t>
+      </w:r>
+      <w:r>
+        <w:t xml:space="preserve">identical, confirming the category-level primary specification is not doing the work</w:t>
+      </w:r>
+      <w:r>
+        <w:t xml:space="preserve"> </w:t>
+      </w:r>
+      <w:r>
+        <w:t xml:space="preserve">(</w:t>
       </w:r>
       <w:r>
         <w:rPr>
@@ -5355,21 +5367,213 @@
         <w:t xml:space="preserve">analysis/robustness_granular_vs_category.csv</w:t>
       </w:r>
       <w:r>
-        <w:t xml:space="preserve">) rebalances far more often</w:t>
-      </w:r>
-      <w:r>
-        <w:t xml:space="preserve"> </w:t>
-      </w:r>
-      <w:r>
-        <w:t xml:space="preserve">(≈61–96 vs ≈36–37 triggers) but leaves CAGR/Sharpe/MaxDD essentially identical, confirming the</w:t>
-      </w:r>
-      <w:r>
-        <w:t xml:space="preserve"> </w:t>
-      </w:r>
-      <w:r>
-        <w:t xml:space="preserve">category-level primary specification is not doing the work.</w:t>
-      </w:r>
-    </w:p>
+        <w:t xml:space="preserve">):</w:t>
+      </w:r>
+    </w:p>
+    <w:tbl>
+      <w:tblPr>
+        <w:tblStyle w:val="Table"/>
+        <w:tblW w:type="auto" w:w="0"/>
+        <w:tblLook w:firstRow="1" w:lastRow="0" w:firstColumn="0" w:lastColumn="0" w:noHBand="0" w:noVBand="0" w:val="0020"/>
+        <w:jc w:val="start"/>
+      </w:tblPr>
+      <w:tblGrid>
+        <w:gridCol w:w="1584"/>
+        <w:gridCol w:w="1584"/>
+        <w:gridCol w:w="1584"/>
+        <w:gridCol w:w="1584"/>
+        <w:gridCol w:w="1584"/>
+      </w:tblGrid>
+      <w:tr>
+        <w:trPr>
+          <w:tblHeader w:val="true"/>
+        </w:trPr>
+        <w:tc>
+          <w:tcPr/>
+          <w:p>
+            <w:pPr>
+              <w:pStyle w:val="Compact"/>
+              <w:jc w:val="left"/>
+            </w:pPr>
+            <w:r>
+              <w:t xml:space="preserve">Band architecture</w:t>
+            </w:r>
+          </w:p>
+        </w:tc>
+        <w:tc>
+          <w:tcPr/>
+          <w:p>
+            <w:pPr>
+              <w:pStyle w:val="Compact"/>
+              <w:jc w:val="left"/>
+            </w:pPr>
+            <w:r>
+              <w:t xml:space="preserve">AP5 CAGR / Sharpe / MaxDD</w:t>
+            </w:r>
+          </w:p>
+        </w:tc>
+        <w:tc>
+          <w:tcPr/>
+          <w:p>
+            <w:pPr>
+              <w:pStyle w:val="Compact"/>
+              <w:jc w:val="left"/>
+            </w:pPr>
+            <w:r>
+              <w:t xml:space="preserve">repl-20</w:t>
+            </w:r>
+          </w:p>
+        </w:tc>
+        <w:tc>
+          <w:tcPr/>
+          <w:p>
+            <w:pPr>
+              <w:pStyle w:val="Compact"/>
+              <w:jc w:val="left"/>
+            </w:pPr>
+            <w:r>
+              <w:t xml:space="preserve">repl-100</w:t>
+            </w:r>
+          </w:p>
+        </w:tc>
+        <w:tc>
+          <w:tcPr/>
+          <w:p>
+            <w:pPr>
+              <w:pStyle w:val="Compact"/>
+              <w:jc w:val="left"/>
+            </w:pPr>
+            <w:r>
+              <w:t xml:space="preserve">rebalances (AP5 / 20 / 100)</w:t>
+            </w:r>
+          </w:p>
+        </w:tc>
+      </w:tr>
+      <w:tr>
+        <w:tc>
+          <w:tcPr/>
+          <w:p>
+            <w:pPr>
+              <w:pStyle w:val="Compact"/>
+              <w:jc w:val="left"/>
+            </w:pPr>
+            <w:r>
+              <w:t xml:space="preserve">Category (primary)</w:t>
+            </w:r>
+          </w:p>
+        </w:tc>
+        <w:tc>
+          <w:tcPr/>
+          <w:p>
+            <w:pPr>
+              <w:pStyle w:val="Compact"/>
+              <w:jc w:val="left"/>
+            </w:pPr>
+            <w:r>
+              <w:t xml:space="preserve">3.5% / 0.48 / −20.3%</w:t>
+            </w:r>
+          </w:p>
+        </w:tc>
+        <w:tc>
+          <w:tcPr/>
+          <w:p>
+            <w:pPr>
+              <w:pStyle w:val="Compact"/>
+              <w:jc w:val="left"/>
+            </w:pPr>
+            <w:r>
+              <w:t xml:space="preserve">3.7% / 0.48 / −21.9%</w:t>
+            </w:r>
+          </w:p>
+        </w:tc>
+        <w:tc>
+          <w:tcPr/>
+          <w:p>
+            <w:pPr>
+              <w:pStyle w:val="Compact"/>
+              <w:jc w:val="left"/>
+            </w:pPr>
+            <w:r>
+              <w:t xml:space="preserve">4.3% / 0.46 / −28.0%</w:t>
+            </w:r>
+          </w:p>
+        </w:tc>
+        <w:tc>
+          <w:tcPr/>
+          <w:p>
+            <w:pPr>
+              <w:pStyle w:val="Compact"/>
+              <w:jc w:val="left"/>
+            </w:pPr>
+            <w:r>
+              <w:t xml:space="preserve">36 / 37 / 37</w:t>
+            </w:r>
+          </w:p>
+        </w:tc>
+      </w:tr>
+      <w:tr>
+        <w:tc>
+          <w:tcPr/>
+          <w:p>
+            <w:pPr>
+              <w:pStyle w:val="Compact"/>
+              <w:jc w:val="left"/>
+            </w:pPr>
+            <w:r>
+              <w:t xml:space="preserve">Per-constituent</w:t>
+            </w:r>
+          </w:p>
+        </w:tc>
+        <w:tc>
+          <w:tcPr/>
+          <w:p>
+            <w:pPr>
+              <w:pStyle w:val="Compact"/>
+              <w:jc w:val="left"/>
+            </w:pPr>
+            <w:r>
+              <w:t xml:space="preserve">3.5% / 0.48 / −20.4%</w:t>
+            </w:r>
+          </w:p>
+        </w:tc>
+        <w:tc>
+          <w:tcPr/>
+          <w:p>
+            <w:pPr>
+              <w:pStyle w:val="Compact"/>
+              <w:jc w:val="left"/>
+            </w:pPr>
+            <w:r>
+              <w:t xml:space="preserve">3.6% / 0.48 / −21.8%</w:t>
+            </w:r>
+          </w:p>
+        </w:tc>
+        <w:tc>
+          <w:tcPr/>
+          <w:p>
+            <w:pPr>
+              <w:pStyle w:val="Compact"/>
+              <w:jc w:val="left"/>
+            </w:pPr>
+            <w:r>
+              <w:t xml:space="preserve">4.3% / 0.46 / −27.9%</w:t>
+            </w:r>
+          </w:p>
+        </w:tc>
+        <w:tc>
+          <w:tcPr/>
+          <w:p>
+            <w:pPr>
+              <w:pStyle w:val="Compact"/>
+              <w:jc w:val="left"/>
+            </w:pPr>
+            <w:r>
+              <w:t xml:space="preserve">61 / 92 / 96</w:t>
+            </w:r>
+          </w:p>
+        </w:tc>
+      </w:tr>
+    </w:tbl>
     <w:bookmarkEnd w:id="30"/>
     <w:bookmarkStart w:id="31" w:name="Xfc36b13871caf1f9162ab9e1ca3df3190bba41e"/>
     <w:p>

</xml_diff>

<commit_message>
Regenerate outputs from 71c4741 (validation-band table + corrected figure labels)
Outputs-only commit. Adds analysis/ap5_validation_band_sensitivity.csv; refreshes
figures 01/08 (EN+FR) for the 2008-02 index-base label; rebuilds DOCX; manifest
generating_commit = 71c4741. No numeric results changed.

Co-Authored-By: Claude Opus 4.8 <noreply@anthropic.com>
Claude-Session: https://claude.ai/code/session_01BpRuhc2aBcap5ePk6Ra9LE
</commit_message>
<xml_diff>
--- a/reports/docx/Bond_replacement_full_report_EN.docx
+++ b/reports/docx/Bond_replacement_full_report_EN.docx
@@ -1507,6 +1507,406 @@
         </w:tc>
       </w:tr>
     </w:tbl>
+    <w:p>
+      <w:pPr>
+        <w:pStyle w:val="BodyText"/>
+      </w:pPr>
+      <w:r>
+        <w:t xml:space="preserve">The validation is</w:t>
+      </w:r>
+      <w:r>
+        <w:t xml:space="preserve"> </w:t>
+      </w:r>
+      <w:r>
+        <w:rPr>
+          <w:bCs/>
+          <w:b/>
+        </w:rPr>
+        <w:t xml:space="preserve">almost independent of the monitoring band</w:t>
+      </w:r>
+      <w:r>
+        <w:t xml:space="preserve">, because VZ's recorded target</w:t>
+      </w:r>
+      <w:r>
+        <w:t xml:space="preserve"> </w:t>
+      </w:r>
+      <w:r>
+        <w:t xml:space="preserve">drift drives most rebalances and the band only triggers between recorded changes</w:t>
+      </w:r>
+      <w:r>
+        <w:t xml:space="preserve"> </w:t>
+      </w:r>
+      <w:r>
+        <w:t xml:space="preserve">(</w:t>
+      </w:r>
+      <w:r>
+        <w:rPr>
+          <w:rStyle w:val="VerbatimChar"/>
+        </w:rPr>
+        <w:t xml:space="preserve">analysis/ap5_validation_band_sensitivity.csv</w:t>
+      </w:r>
+      <w:r>
+        <w:t xml:space="preserve">):</w:t>
+      </w:r>
+    </w:p>
+    <w:tbl>
+      <w:tblPr>
+        <w:tblStyle w:val="Table"/>
+        <w:tblW w:type="auto" w:w="0"/>
+        <w:tblLook w:firstRow="1" w:lastRow="0" w:firstColumn="0" w:lastColumn="0" w:noHBand="0" w:noVBand="0" w:val="0020"/>
+        <w:jc w:val="start"/>
+      </w:tblPr>
+      <w:tblGrid>
+        <w:gridCol w:w="1584"/>
+        <w:gridCol w:w="1584"/>
+        <w:gridCol w:w="1584"/>
+        <w:gridCol w:w="1584"/>
+        <w:gridCol w:w="1584"/>
+      </w:tblGrid>
+      <w:tr>
+        <w:trPr>
+          <w:tblHeader w:val="true"/>
+        </w:trPr>
+        <w:tc>
+          <w:tcPr/>
+          <w:p>
+            <w:pPr>
+              <w:pStyle w:val="Compact"/>
+              <w:jc w:val="left"/>
+            </w:pPr>
+            <w:r>
+              <w:t xml:space="preserve">Validation band</w:t>
+            </w:r>
+          </w:p>
+        </w:tc>
+        <w:tc>
+          <w:tcPr/>
+          <w:p>
+            <w:pPr>
+              <w:pStyle w:val="Compact"/>
+              <w:jc w:val="left"/>
+            </w:pPr>
+            <w:r>
+              <w:t xml:space="preserve">corr</w:t>
+            </w:r>
+          </w:p>
+        </w:tc>
+        <w:tc>
+          <w:tcPr/>
+          <w:p>
+            <w:pPr>
+              <w:pStyle w:val="Compact"/>
+              <w:jc w:val="left"/>
+            </w:pPr>
+            <w:r>
+              <w:t xml:space="preserve">TE (ann.)</w:t>
+            </w:r>
+          </w:p>
+        </w:tc>
+        <w:tc>
+          <w:tcPr/>
+          <w:p>
+            <w:pPr>
+              <w:pStyle w:val="Compact"/>
+              <w:jc w:val="left"/>
+            </w:pPr>
+            <w:r>
+              <w:t xml:space="preserve">β</w:t>
+            </w:r>
+          </w:p>
+        </w:tc>
+        <w:tc>
+          <w:tcPr/>
+          <w:p>
+            <w:pPr>
+              <w:pStyle w:val="Compact"/>
+              <w:jc w:val="left"/>
+            </w:pPr>
+            <w:r>
+              <w:t xml:space="preserve">R²</w:t>
+            </w:r>
+          </w:p>
+        </w:tc>
+      </w:tr>
+      <w:tr>
+        <w:tc>
+          <w:tcPr/>
+          <w:p>
+            <w:pPr>
+              <w:pStyle w:val="Compact"/>
+              <w:jc w:val="left"/>
+            </w:pPr>
+            <w:r>
+              <w:t xml:space="preserve">±5% (base)</w:t>
+            </w:r>
+          </w:p>
+        </w:tc>
+        <w:tc>
+          <w:tcPr/>
+          <w:p>
+            <w:pPr>
+              <w:pStyle w:val="Compact"/>
+              <w:jc w:val="left"/>
+            </w:pPr>
+            <w:r>
+              <w:t xml:space="preserve">0.9543</w:t>
+            </w:r>
+          </w:p>
+        </w:tc>
+        <w:tc>
+          <w:tcPr/>
+          <w:p>
+            <w:pPr>
+              <w:pStyle w:val="Compact"/>
+              <w:jc w:val="left"/>
+            </w:pPr>
+            <w:r>
+              <w:t xml:space="preserve">2.37%</w:t>
+            </w:r>
+          </w:p>
+        </w:tc>
+        <w:tc>
+          <w:tcPr/>
+          <w:p>
+            <w:pPr>
+              <w:pStyle w:val="Compact"/>
+              <w:jc w:val="left"/>
+            </w:pPr>
+            <w:r>
+              <w:t xml:space="preserve">0.970</w:t>
+            </w:r>
+          </w:p>
+        </w:tc>
+        <w:tc>
+          <w:tcPr/>
+          <w:p>
+            <w:pPr>
+              <w:pStyle w:val="Compact"/>
+              <w:jc w:val="left"/>
+            </w:pPr>
+            <w:r>
+              <w:t xml:space="preserve">0.911</w:t>
+            </w:r>
+          </w:p>
+        </w:tc>
+      </w:tr>
+      <w:tr>
+        <w:tc>
+          <w:tcPr/>
+          <w:p>
+            <w:pPr>
+              <w:pStyle w:val="Compact"/>
+              <w:jc w:val="left"/>
+            </w:pPr>
+            <w:r>
+              <w:t xml:space="preserve">±8% (main-model band)</w:t>
+            </w:r>
+          </w:p>
+        </w:tc>
+        <w:tc>
+          <w:tcPr/>
+          <w:p>
+            <w:pPr>
+              <w:pStyle w:val="Compact"/>
+              <w:jc w:val="left"/>
+            </w:pPr>
+            <w:r>
+              <w:t xml:space="preserve">0.9540</w:t>
+            </w:r>
+          </w:p>
+        </w:tc>
+        <w:tc>
+          <w:tcPr/>
+          <w:p>
+            <w:pPr>
+              <w:pStyle w:val="Compact"/>
+              <w:jc w:val="left"/>
+            </w:pPr>
+            <w:r>
+              <w:t xml:space="preserve">2.38%</w:t>
+            </w:r>
+          </w:p>
+        </w:tc>
+        <w:tc>
+          <w:tcPr/>
+          <w:p>
+            <w:pPr>
+              <w:pStyle w:val="Compact"/>
+              <w:jc w:val="left"/>
+            </w:pPr>
+            <w:r>
+              <w:t xml:space="preserve">0.967</w:t>
+            </w:r>
+          </w:p>
+        </w:tc>
+        <w:tc>
+          <w:tcPr/>
+          <w:p>
+            <w:pPr>
+              <w:pStyle w:val="Compact"/>
+              <w:jc w:val="left"/>
+            </w:pPr>
+            <w:r>
+              <w:t xml:space="preserve">0.910</w:t>
+            </w:r>
+          </w:p>
+        </w:tc>
+      </w:tr>
+      <w:tr>
+        <w:tc>
+          <w:tcPr/>
+          <w:p>
+            <w:pPr>
+              <w:pStyle w:val="Compact"/>
+              <w:jc w:val="left"/>
+            </w:pPr>
+            <w:r>
+              <w:t xml:space="preserve">±10%</w:t>
+            </w:r>
+          </w:p>
+        </w:tc>
+        <w:tc>
+          <w:tcPr/>
+          <w:p>
+            <w:pPr>
+              <w:pStyle w:val="Compact"/>
+              <w:jc w:val="left"/>
+            </w:pPr>
+            <w:r>
+              <w:t xml:space="preserve">0.9540</w:t>
+            </w:r>
+          </w:p>
+        </w:tc>
+        <w:tc>
+          <w:tcPr/>
+          <w:p>
+            <w:pPr>
+              <w:pStyle w:val="Compact"/>
+              <w:jc w:val="left"/>
+            </w:pPr>
+            <w:r>
+              <w:t xml:space="preserve">2.38%</w:t>
+            </w:r>
+          </w:p>
+        </w:tc>
+        <w:tc>
+          <w:tcPr/>
+          <w:p>
+            <w:pPr>
+              <w:pStyle w:val="Compact"/>
+              <w:jc w:val="left"/>
+            </w:pPr>
+            <w:r>
+              <w:t xml:space="preserve">0.967</w:t>
+            </w:r>
+          </w:p>
+        </w:tc>
+        <w:tc>
+          <w:tcPr/>
+          <w:p>
+            <w:pPr>
+              <w:pStyle w:val="Compact"/>
+              <w:jc w:val="left"/>
+            </w:pPr>
+            <w:r>
+              <w:t xml:space="preserve">0.910</w:t>
+            </w:r>
+          </w:p>
+        </w:tc>
+      </w:tr>
+      <w:tr>
+        <w:tc>
+          <w:tcPr/>
+          <w:p>
+            <w:pPr>
+              <w:pStyle w:val="Compact"/>
+              <w:jc w:val="left"/>
+            </w:pPr>
+            <w:r>
+              <w:t xml:space="preserve">±20%</w:t>
+            </w:r>
+          </w:p>
+        </w:tc>
+        <w:tc>
+          <w:tcPr/>
+          <w:p>
+            <w:pPr>
+              <w:pStyle w:val="Compact"/>
+              <w:jc w:val="left"/>
+            </w:pPr>
+            <w:r>
+              <w:t xml:space="preserve">0.9525</w:t>
+            </w:r>
+          </w:p>
+        </w:tc>
+        <w:tc>
+          <w:tcPr/>
+          <w:p>
+            <w:pPr>
+              <w:pStyle w:val="Compact"/>
+              <w:jc w:val="left"/>
+            </w:pPr>
+            <w:r>
+              <w:t xml:space="preserve">2.41%</w:t>
+            </w:r>
+          </w:p>
+        </w:tc>
+        <w:tc>
+          <w:tcPr/>
+          <w:p>
+            <w:pPr>
+              <w:pStyle w:val="Compact"/>
+              <w:jc w:val="left"/>
+            </w:pPr>
+            <w:r>
+              <w:t xml:space="preserve">0.969</w:t>
+            </w:r>
+          </w:p>
+        </w:tc>
+        <w:tc>
+          <w:tcPr/>
+          <w:p>
+            <w:pPr>
+              <w:pStyle w:val="Compact"/>
+              <w:jc w:val="left"/>
+            </w:pPr>
+            <w:r>
+              <w:t xml:space="preserve">0.907</w:t>
+            </w:r>
+          </w:p>
+        </w:tc>
+      </w:tr>
+    </w:tbl>
+    <w:p>
+      <w:pPr>
+        <w:pStyle w:val="BodyText"/>
+      </w:pPr>
+      <w:r>
+        <w:t xml:space="preserve">So the excellent validation is</w:t>
+      </w:r>
+      <w:r>
+        <w:t xml:space="preserve"> </w:t>
+      </w:r>
+      <w:r>
+        <w:rPr>
+          <w:bCs/>
+          <w:b/>
+        </w:rPr>
+        <w:t xml:space="preserve">not an artefact of the tight 5% band</w:t>
+      </w:r>
+      <w:r>
+        <w:t xml:space="preserve"> </w:t>
+      </w:r>
+      <w:r>
+        <w:t xml:space="preserve">— it holds equally at the</w:t>
+      </w:r>
+      <w:r>
+        <w:t xml:space="preserve"> </w:t>
+      </w:r>
+      <w:r>
+        <w:t xml:space="preserve">±8% base band used by the main model.</w:t>
+      </w:r>
+    </w:p>
     <w:p>
       <w:pPr>
         <w:pStyle w:val="BodyText"/>

</xml_diff>